<commit_message>
docs(windows): check for any Python 3.11+ rather than requiring 3.11 exactly
requires-python is >=3.11, so 3.12 and 3.13 are fine, but the guide told
Yogesh to run `py -3.11` and he hit 'No suitable Python runtime found'
because that exact version was not installed.

The guide now starts with `py -0` to list what is present, with a table
for each case, and notes that matching CI's 3.11 is preferable when
installing fresh but not required.

Co-Authored-By: Claude Opus 5 <noreply@anthropic.com>
</commit_message>
<xml_diff>
--- a/docs/process/VPSim_Windows_Setup.docx
+++ b/docs/process/VPSim_Windows_Setup.docx
@@ -522,7 +522,7 @@
         </w:rPr>
         <w:t xml:space="preserve">Read </w:t>
       </w:r>
-      <w:hyperlink w:history="1" r:id="rIdrwbl4m9jd4b018hg_h4cx">
+      <w:hyperlink w:history="1" r:id="rIdrgq3umgn742bclvln8bdh">
         <w:r>
           <w:rPr>
             <w:color w:val="1F7A8C"/>
@@ -1199,11 +1199,21 @@
       </w:pPr>
       <w:r>
         <w:rPr>
-          <w:color w:val="13272F"/>
-          <w:sz w:val="20"/>
-          <w:szCs w:val="20"/>
-        </w:rPr>
-        <w:t xml:space="preserve">Check afterwards, in a </w:t>
+          <w:b/>
+          <w:bCs/>
+          <w:color w:val="13272F"/>
+          <w:sz w:val="20"/>
+          <w:szCs w:val="20"/>
+        </w:rPr>
+        <w:t xml:space="preserve">First, check what you already have.</w:t>
+      </w:r>
+      <w:r>
+        <w:rPr>
+          <w:color w:val="13272F"/>
+          <w:sz w:val="20"/>
+          <w:szCs w:val="20"/>
+        </w:rPr>
+        <w:t xml:space="preserve"> In a </w:t>
       </w:r>
       <w:r>
         <w:rPr>
@@ -1249,35 +1259,30 @@
           <w:sz w:val="16"/>
           <w:szCs w:val="16"/>
         </w:rPr>
-        <w:t xml:space="preserve"> --</w:t>
-      </w:r>
-      <w:r>
-        <w:rPr>
-          <w:rFonts w:ascii="Consolas" w:cs="Consolas" w:eastAsia="Consolas" w:hAnsi="Consolas"/>
-          <w:color w:val="13272F"/>
-          <w:sz w:val="16"/>
-          <w:szCs w:val="16"/>
-        </w:rPr>
-        <w:t xml:space="preserve">version</w:t>
-      </w:r>
-    </w:p>
-    <w:p>
-      <w:pPr>
-        <w:spacing w:after="120" w:before="60" w:line="300"/>
-      </w:pPr>
-      <w:r>
-        <w:rPr>
-          <w:color w:val="13272F"/>
-          <w:sz w:val="20"/>
-          <w:szCs w:val="20"/>
-        </w:rPr>
-        <w:t xml:space="preserve">It must say 3.11 or higher. If you already had an older Python, that is fine —</w:t>
-      </w:r>
-    </w:p>
-    <w:p>
-      <w:pPr>
-        <w:spacing w:after="120" w:before="60" w:line="300"/>
-      </w:pPr>
+        <w:t xml:space="preserve"> -</w:t>
+      </w:r>
+      <w:r>
+        <w:rPr>
+          <w:rFonts w:ascii="Consolas" w:cs="Consolas" w:eastAsia="Consolas" w:hAnsi="Consolas"/>
+          <w:color w:val="098658"/>
+          <w:sz w:val="16"/>
+          <w:szCs w:val="16"/>
+        </w:rPr>
+        <w:t xml:space="preserve">0</w:t>
+      </w:r>
+    </w:p>
+    <w:p>
+      <w:pPr>
+        <w:spacing w:after="120" w:before="60" w:line="300"/>
+      </w:pPr>
+      <w:r>
+        <w:rPr>
+          <w:color w:val="13272F"/>
+          <w:sz w:val="20"/>
+          <w:szCs w:val="20"/>
+        </w:rPr>
+        <w:t xml:space="preserve">That lists every Python on the machine, like </w:t>
+      </w:r>
       <w:r>
         <w:rPr>
           <w:rFonts w:ascii="Consolas" w:cs="Consolas" w:eastAsia="Consolas" w:hAnsi="Consolas"/>
@@ -1285,15 +1290,434 @@
           <w:sz w:val="18"/>
           <w:szCs w:val="18"/>
         </w:rPr>
-        <w:t xml:space="preserve">py -3.11</w:t>
-      </w:r>
-      <w:r>
-        <w:rPr>
-          <w:color w:val="13272F"/>
-          <w:sz w:val="20"/>
-          <w:szCs w:val="20"/>
-        </w:rPr>
-        <w:t xml:space="preserve"> selects the right one explicitly.</w:t>
+        <w:t xml:space="preserve">-V:3.13 *</w:t>
+      </w:r>
+      <w:r>
+        <w:rPr>
+          <w:color w:val="13272F"/>
+          <w:sz w:val="20"/>
+          <w:szCs w:val="20"/>
+        </w:rPr>
+        <w:t xml:space="preserve"> or </w:t>
+      </w:r>
+      <w:r>
+        <w:rPr>
+          <w:rFonts w:ascii="Consolas" w:cs="Consolas" w:eastAsia="Consolas" w:hAnsi="Consolas"/>
+          <w:color w:val="B3651F"/>
+          <w:sz w:val="18"/>
+          <w:szCs w:val="18"/>
+        </w:rPr>
+        <w:t xml:space="preserve">-V:3.11</w:t>
+      </w:r>
+      <w:r>
+        <w:rPr>
+          <w:color w:val="13272F"/>
+          <w:sz w:val="20"/>
+          <w:szCs w:val="20"/>
+        </w:rPr>
+        <w:t xml:space="preserve">.</w:t>
+      </w:r>
+    </w:p>
+    <w:tbl>
+      <w:tblPr>
+        <w:tblW w:type="dxa" w:w="9360"/>
+        <w:tblBorders>
+          <w:top w:val="single" w:color="D6E2E6" w:sz="2"/>
+          <w:left w:val="single" w:color="D6E2E6" w:sz="2"/>
+          <w:bottom w:val="single" w:color="D6E2E6" w:sz="2"/>
+          <w:right w:val="single" w:color="D6E2E6" w:sz="2"/>
+          <w:insideH w:val="single" w:color="D6E2E6" w:sz="1"/>
+          <w:insideV w:val="single" w:color="D6E2E6" w:sz="1"/>
+        </w:tblBorders>
+      </w:tblPr>
+      <w:tblGrid>
+        <w:gridCol w:w="3914"/>
+        <w:gridCol w:w="5446"/>
+      </w:tblGrid>
+      <w:tr>
+        <w:trPr>
+          <w:tblHeader/>
+        </w:trPr>
+        <w:tc>
+          <w:tcPr>
+            <w:tcW w:type="dxa" w:w="3914"/>
+            <w:shd w:fill="13272F" w:val="clear"/>
+            <w:tcMar>
+              <w:top w:type="dxa" w:w="70"/>
+              <w:left w:type="dxa" w:w="110"/>
+              <w:bottom w:type="dxa" w:w="70"/>
+              <w:right w:type="dxa" w:w="110"/>
+            </w:tcMar>
+          </w:tcPr>
+          <w:p>
+            <w:pPr>
+              <w:spacing w:after="0" w:before="0"/>
+            </w:pPr>
+            <w:r>
+              <w:rPr>
+                <w:b/>
+                <w:bCs/>
+                <w:color w:val="FFFFFF"/>
+                <w:sz w:val="17"/>
+                <w:szCs w:val="17"/>
+              </w:rPr>
+              <w:t xml:space="preserve">What it shows</w:t>
+            </w:r>
+          </w:p>
+        </w:tc>
+        <w:tc>
+          <w:tcPr>
+            <w:tcW w:type="dxa" w:w="5446"/>
+            <w:shd w:fill="13272F" w:val="clear"/>
+            <w:tcMar>
+              <w:top w:type="dxa" w:w="70"/>
+              <w:left w:type="dxa" w:w="110"/>
+              <w:bottom w:type="dxa" w:w="70"/>
+              <w:right w:type="dxa" w:w="110"/>
+            </w:tcMar>
+          </w:tcPr>
+          <w:p>
+            <w:pPr>
+              <w:spacing w:after="0" w:before="0"/>
+            </w:pPr>
+            <w:r>
+              <w:rPr>
+                <w:b/>
+                <w:bCs/>
+                <w:color w:val="FFFFFF"/>
+                <w:sz w:val="17"/>
+                <w:szCs w:val="17"/>
+              </w:rPr>
+              <w:t xml:space="preserve">What to do</w:t>
+            </w:r>
+          </w:p>
+        </w:tc>
+      </w:tr>
+      <w:tr>
+        <w:trPr>
+          <w:tblHeader w:val="false"/>
+        </w:trPr>
+        <w:tc>
+          <w:tcPr>
+            <w:tcW w:type="dxa" w:w="3914"/>
+            <w:shd w:fill="FFFFFF" w:val="clear"/>
+            <w:tcMar>
+              <w:top w:type="dxa" w:w="70"/>
+              <w:left w:type="dxa" w:w="110"/>
+              <w:bottom w:type="dxa" w:w="70"/>
+              <w:right w:type="dxa" w:w="110"/>
+            </w:tcMar>
+          </w:tcPr>
+          <w:p>
+            <w:pPr>
+              <w:spacing w:after="0" w:before="0"/>
+            </w:pPr>
+            <w:r>
+              <w:rPr>
+                <w:b/>
+                <w:bCs/>
+                <w:color w:val="13272F"/>
+                <w:sz w:val="17"/>
+                <w:szCs w:val="17"/>
+              </w:rPr>
+              <w:t xml:space="preserve">3.11, 3.12, 3.13 or newer</w:t>
+            </w:r>
+          </w:p>
+        </w:tc>
+        <w:tc>
+          <w:tcPr>
+            <w:tcW w:type="dxa" w:w="5446"/>
+            <w:shd w:fill="FFFFFF" w:val="clear"/>
+            <w:tcMar>
+              <w:top w:type="dxa" w:w="70"/>
+              <w:left w:type="dxa" w:w="110"/>
+              <w:bottom w:type="dxa" w:w="70"/>
+              <w:right w:type="dxa" w:w="110"/>
+            </w:tcMar>
+          </w:tcPr>
+          <w:p>
+            <w:pPr>
+              <w:spacing w:after="0" w:before="0"/>
+            </w:pPr>
+            <w:r>
+              <w:rPr>
+                <w:color w:val="13272F"/>
+                <w:sz w:val="17"/>
+                <w:szCs w:val="17"/>
+              </w:rPr>
+              <w:t xml:space="preserve">You are fine. Use that number in §4 — e.g. </w:t>
+            </w:r>
+            <w:r>
+              <w:rPr>
+                <w:rFonts w:ascii="Consolas" w:cs="Consolas" w:eastAsia="Consolas" w:hAnsi="Consolas"/>
+                <w:color w:val="B3651F"/>
+                <w:sz w:val="15"/>
+                <w:szCs w:val="15"/>
+              </w:rPr>
+              <w:t xml:space="preserve">py -3.13 -m venv venv</w:t>
+            </w:r>
+          </w:p>
+        </w:tc>
+      </w:tr>
+      <w:tr>
+        <w:trPr>
+          <w:tblHeader w:val="false"/>
+        </w:trPr>
+        <w:tc>
+          <w:tcPr>
+            <w:tcW w:type="dxa" w:w="3914"/>
+            <w:shd w:fill="F7FAFB" w:val="clear"/>
+            <w:tcMar>
+              <w:top w:type="dxa" w:w="70"/>
+              <w:left w:type="dxa" w:w="110"/>
+              <w:bottom w:type="dxa" w:w="70"/>
+              <w:right w:type="dxa" w:w="110"/>
+            </w:tcMar>
+          </w:tcPr>
+          <w:p>
+            <w:pPr>
+              <w:spacing w:after="0" w:before="0"/>
+            </w:pPr>
+            <w:r>
+              <w:rPr>
+                <w:b/>
+                <w:bCs/>
+                <w:color w:val="13272F"/>
+                <w:sz w:val="17"/>
+                <w:szCs w:val="17"/>
+              </w:rPr>
+              <w:t xml:space="preserve">only 3.10 or older</w:t>
+            </w:r>
+          </w:p>
+        </w:tc>
+        <w:tc>
+          <w:tcPr>
+            <w:tcW w:type="dxa" w:w="5446"/>
+            <w:shd w:fill="F7FAFB" w:val="clear"/>
+            <w:tcMar>
+              <w:top w:type="dxa" w:w="70"/>
+              <w:left w:type="dxa" w:w="110"/>
+              <w:bottom w:type="dxa" w:w="70"/>
+              <w:right w:type="dxa" w:w="110"/>
+            </w:tcMar>
+          </w:tcPr>
+          <w:p>
+            <w:pPr>
+              <w:spacing w:after="0" w:before="0"/>
+            </w:pPr>
+            <w:r>
+              <w:rPr>
+                <w:color w:val="13272F"/>
+                <w:sz w:val="17"/>
+                <w:szCs w:val="17"/>
+              </w:rPr>
+              <w:t xml:space="preserve">Install a newer one, below</w:t>
+            </w:r>
+          </w:p>
+        </w:tc>
+      </w:tr>
+      <w:tr>
+        <w:trPr>
+          <w:tblHeader w:val="false"/>
+        </w:trPr>
+        <w:tc>
+          <w:tcPr>
+            <w:tcW w:type="dxa" w:w="3914"/>
+            <w:shd w:fill="FFFFFF" w:val="clear"/>
+            <w:tcMar>
+              <w:top w:type="dxa" w:w="70"/>
+              <w:left w:type="dxa" w:w="110"/>
+              <w:bottom w:type="dxa" w:w="70"/>
+              <w:right w:type="dxa" w:w="110"/>
+            </w:tcMar>
+          </w:tcPr>
+          <w:p>
+            <w:pPr>
+              <w:spacing w:after="0" w:before="0"/>
+            </w:pPr>
+            <w:r>
+              <w:rPr>
+                <w:b/>
+                <w:bCs/>
+                <w:color w:val="13272F"/>
+                <w:sz w:val="17"/>
+                <w:szCs w:val="17"/>
+              </w:rPr>
+              <w:t xml:space="preserve">nothing, or "No suitable Python runtime found"</w:t>
+            </w:r>
+          </w:p>
+        </w:tc>
+        <w:tc>
+          <w:tcPr>
+            <w:tcW w:type="dxa" w:w="5446"/>
+            <w:shd w:fill="FFFFFF" w:val="clear"/>
+            <w:tcMar>
+              <w:top w:type="dxa" w:w="70"/>
+              <w:left w:type="dxa" w:w="110"/>
+              <w:bottom w:type="dxa" w:w="70"/>
+              <w:right w:type="dxa" w:w="110"/>
+            </w:tcMar>
+          </w:tcPr>
+          <w:p>
+            <w:pPr>
+              <w:spacing w:after="0" w:before="0"/>
+            </w:pPr>
+            <w:r>
+              <w:rPr>
+                <w:color w:val="13272F"/>
+                <w:sz w:val="17"/>
+                <w:szCs w:val="17"/>
+              </w:rPr>
+              <w:t xml:space="preserve">Install one, below</w:t>
+            </w:r>
+          </w:p>
+        </w:tc>
+      </w:tr>
+    </w:tbl>
+    <w:p>
+      <w:pPr>
+        <w:spacing w:after="160"/>
+      </w:pPr>
+    </w:p>
+    <w:p>
+      <w:pPr>
+        <w:spacing w:after="120" w:before="60" w:line="300"/>
+      </w:pPr>
+      <w:r>
+        <w:rPr>
+          <w:rFonts w:ascii="Consolas" w:cs="Consolas" w:eastAsia="Consolas" w:hAnsi="Consolas"/>
+          <w:color w:val="B3651F"/>
+          <w:sz w:val="18"/>
+          <w:szCs w:val="18"/>
+        </w:rPr>
+        <w:t xml:space="preserve">requires-python = "&gt;=3.11"</w:t>
+      </w:r>
+      <w:r>
+        <w:rPr>
+          <w:color w:val="13272F"/>
+          <w:sz w:val="20"/>
+          <w:szCs w:val="20"/>
+        </w:rPr>
+        <w:t xml:space="preserve">, so anything from 3.11 up works.</w:t>
+      </w:r>
+    </w:p>
+    <w:p>
+      <w:pPr>
+        <w:spacing w:after="120" w:before="60" w:line="300"/>
+      </w:pPr>
+      <w:r>
+        <w:rPr>
+          <w:b/>
+          <w:bCs/>
+          <w:color w:val="13272F"/>
+          <w:sz w:val="20"/>
+          <w:szCs w:val="20"/>
+        </w:rPr>
+        <w:t xml:space="preserve">If you need to install:</w:t>
+      </w:r>
+      <w:r>
+        <w:rPr>
+          <w:color w:val="13272F"/>
+          <w:sz w:val="20"/>
+          <w:szCs w:val="20"/>
+        </w:rPr>
+        <w:t xml:space="preserve"> get </w:t>
+      </w:r>
+      <w:r>
+        <w:rPr>
+          <w:b/>
+          <w:bCs/>
+          <w:color w:val="13272F"/>
+          <w:sz w:val="20"/>
+          <w:szCs w:val="20"/>
+        </w:rPr>
+        <w:t xml:space="preserve">Python 3.11.x</w:t>
+      </w:r>
+      <w:r>
+        <w:rPr>
+          <w:color w:val="13272F"/>
+          <w:sz w:val="20"/>
+          <w:szCs w:val="20"/>
+        </w:rPr>
+        <w:t xml:space="preserve"> from python.org — not</w:t>
+      </w:r>
+    </w:p>
+    <w:p>
+      <w:pPr>
+        <w:spacing w:after="120" w:before="60" w:line="300"/>
+      </w:pPr>
+      <w:r>
+        <w:rPr>
+          <w:color w:val="13272F"/>
+          <w:sz w:val="20"/>
+          <w:szCs w:val="20"/>
+        </w:rPr>
+        <w:t xml:space="preserve">necessarily the newest release. CI runs 3.11 and the container is</w:t>
+      </w:r>
+    </w:p>
+    <w:p>
+      <w:pPr>
+        <w:spacing w:after="120" w:before="60" w:line="300"/>
+      </w:pPr>
+      <w:r>
+        <w:rPr>
+          <w:rFonts w:ascii="Consolas" w:cs="Consolas" w:eastAsia="Consolas" w:hAnsi="Consolas"/>
+          <w:color w:val="B3651F"/>
+          <w:sz w:val="18"/>
+          <w:szCs w:val="18"/>
+        </w:rPr>
+        <w:t xml:space="preserve">python:3.11-slim</w:t>
+      </w:r>
+      <w:r>
+        <w:rPr>
+          <w:color w:val="13272F"/>
+          <w:sz w:val="20"/>
+          <w:szCs w:val="20"/>
+        </w:rPr>
+        <w:t xml:space="preserve">, so matching it removes a class of "works locally, fails in</w:t>
+      </w:r>
+    </w:p>
+    <w:p>
+      <w:pPr>
+        <w:spacing w:after="120" w:before="60" w:line="300"/>
+      </w:pPr>
+      <w:r>
+        <w:rPr>
+          <w:color w:val="13272F"/>
+          <w:sz w:val="20"/>
+          <w:szCs w:val="20"/>
+        </w:rPr>
+        <w:t xml:space="preserve">CI" problem. Newer works too; there is just no upside to differing.</w:t>
+      </w:r>
+    </w:p>
+    <w:p>
+      <w:pPr>
+        <w:spacing w:after="120" w:before="60" w:line="300"/>
+      </w:pPr>
+      <w:r>
+        <w:rPr>
+          <w:color w:val="13272F"/>
+          <w:sz w:val="20"/>
+          <w:szCs w:val="20"/>
+        </w:rPr>
+        <w:t xml:space="preserve">Close and reopen PowerShell afterwards, or </w:t>
+      </w:r>
+      <w:r>
+        <w:rPr>
+          <w:rFonts w:ascii="Consolas" w:cs="Consolas" w:eastAsia="Consolas" w:hAnsi="Consolas"/>
+          <w:color w:val="B3651F"/>
+          <w:sz w:val="18"/>
+          <w:szCs w:val="18"/>
+        </w:rPr>
+        <w:t xml:space="preserve">py</w:t>
+      </w:r>
+      <w:r>
+        <w:rPr>
+          <w:color w:val="13272F"/>
+          <w:sz w:val="20"/>
+          <w:szCs w:val="20"/>
+        </w:rPr>
+        <w:t xml:space="preserve"> will not see it.</w:t>
       </w:r>
     </w:p>
     <w:p>
@@ -2654,6 +3078,97 @@
           <w:szCs w:val="16"/>
         </w:rPr>
         <w:t xml:space="preserve">venv</w:t>
+      </w:r>
+    </w:p>
+    <w:p>
+      <w:pPr>
+        <w:spacing w:after="120" w:before="60" w:line="300"/>
+      </w:pPr>
+      <w:r>
+        <w:rPr>
+          <w:color w:val="13272F"/>
+          <w:sz w:val="20"/>
+          <w:szCs w:val="20"/>
+        </w:rPr>
+        <w:t xml:space="preserve">Substitute whichever version </w:t>
+      </w:r>
+      <w:r>
+        <w:rPr>
+          <w:rFonts w:ascii="Consolas" w:cs="Consolas" w:eastAsia="Consolas" w:hAnsi="Consolas"/>
+          <w:color w:val="B3651F"/>
+          <w:sz w:val="18"/>
+          <w:szCs w:val="18"/>
+        </w:rPr>
+        <w:t xml:space="preserve">py -0</w:t>
+      </w:r>
+      <w:r>
+        <w:rPr>
+          <w:color w:val="13272F"/>
+          <w:sz w:val="20"/>
+          <w:szCs w:val="20"/>
+        </w:rPr>
+        <w:t xml:space="preserve"> showed — </w:t>
+      </w:r>
+      <w:r>
+        <w:rPr>
+          <w:rFonts w:ascii="Consolas" w:cs="Consolas" w:eastAsia="Consolas" w:hAnsi="Consolas"/>
+          <w:color w:val="B3651F"/>
+          <w:sz w:val="18"/>
+          <w:szCs w:val="18"/>
+        </w:rPr>
+        <w:t xml:space="preserve">py -3.13 -m venv venv</w:t>
+      </w:r>
+      <w:r>
+        <w:rPr>
+          <w:color w:val="13272F"/>
+          <w:sz w:val="20"/>
+          <w:szCs w:val="20"/>
+        </w:rPr>
+        <w:t xml:space="preserve"> and so on.</w:t>
+      </w:r>
+    </w:p>
+    <w:p>
+      <w:pPr>
+        <w:spacing w:after="120" w:before="60" w:line="300"/>
+      </w:pPr>
+      <w:r>
+        <w:rPr>
+          <w:color w:val="13272F"/>
+          <w:sz w:val="20"/>
+          <w:szCs w:val="20"/>
+        </w:rPr>
+        <w:t xml:space="preserve">If this says </w:t>
+      </w:r>
+      <w:r>
+        <w:rPr>
+          <w:b/>
+          <w:bCs/>
+          <w:color w:val="13272F"/>
+          <w:sz w:val="20"/>
+          <w:szCs w:val="20"/>
+        </w:rPr>
+        <w:t xml:space="preserve">"No suitable Python runtime found"</w:t>
+      </w:r>
+      <w:r>
+        <w:rPr>
+          <w:color w:val="13272F"/>
+          <w:sz w:val="20"/>
+          <w:szCs w:val="20"/>
+        </w:rPr>
+        <w:t xml:space="preserve">, that version is not</w:t>
+      </w:r>
+    </w:p>
+    <w:p>
+      <w:pPr>
+        <w:spacing w:after="120" w:before="60" w:line="300"/>
+      </w:pPr>
+      <w:r>
+        <w:rPr>
+          <w:color w:val="13272F"/>
+          <w:sz w:val="20"/>
+          <w:szCs w:val="20"/>
+        </w:rPr>
+        <w:t xml:space="preserve">installed; go back to §1.</w:t>
       </w:r>
     </w:p>
     <w:p>
@@ -7560,7 +8075,7 @@
                 <w:sz w:val="17"/>
                 <w:szCs w:val="17"/>
               </w:rPr>
-              <w:t xml:space="preserve">wrong Python — recreate the venv with </w:t>
+              <w:t xml:space="preserve">wrong Python — delete </w:t>
             </w:r>
             <w:r>
               <w:rPr>
@@ -7569,7 +8084,15 @@
                 <w:sz w:val="15"/>
                 <w:szCs w:val="15"/>
               </w:rPr>
-              <w:t xml:space="preserve">py -3.11 -m venv venv</w:t>
+              <w:t xml:space="preserve">venv\</w:t>
+            </w:r>
+            <w:r>
+              <w:rPr>
+                <w:color w:val="13272F"/>
+                <w:sz w:val="17"/>
+                <w:szCs w:val="17"/>
+              </w:rPr>
+              <w:t xml:space="preserve">, then recreate with a 3.11+ version</w:t>
             </w:r>
           </w:p>
         </w:tc>
@@ -7600,7 +8123,7 @@
                 <w:sz w:val="15"/>
                 <w:szCs w:val="15"/>
               </w:rPr>
-              <w:t xml:space="preserve">docker: command not found</w:t>
+              <w:t xml:space="preserve">No suitable Python runtime found</w:t>
             </w:r>
           </w:p>
         </w:tc>
@@ -7625,7 +8148,24 @@
                 <w:sz w:val="17"/>
                 <w:szCs w:val="17"/>
               </w:rPr>
-              <w:t xml:space="preserve">Docker Desktop not installed, or not launched</w:t>
+              <w:t xml:space="preserve">that version is not installed. </w:t>
+            </w:r>
+            <w:r>
+              <w:rPr>
+                <w:rFonts w:ascii="Consolas" w:cs="Consolas" w:eastAsia="Consolas" w:hAnsi="Consolas"/>
+                <w:color w:val="B3651F"/>
+                <w:sz w:val="15"/>
+                <w:szCs w:val="15"/>
+              </w:rPr>
+              <w:t xml:space="preserve">py -0</w:t>
+            </w:r>
+            <w:r>
+              <w:rPr>
+                <w:color w:val="13272F"/>
+                <w:sz w:val="17"/>
+                <w:szCs w:val="17"/>
+              </w:rPr>
+              <w:t xml:space="preserve"> lists what you have</w:t>
             </w:r>
           </w:p>
         </w:tc>
@@ -7656,7 +8196,7 @@
                 <w:sz w:val="15"/>
                 <w:szCs w:val="15"/>
               </w:rPr>
-              <w:t xml:space="preserve">Cannot connect to the Docker daemon</w:t>
+              <w:t xml:space="preserve">docker: command not found</w:t>
             </w:r>
           </w:p>
         </w:tc>
@@ -7681,7 +8221,7 @@
                 <w:sz w:val="17"/>
                 <w:szCs w:val="17"/>
               </w:rPr>
-              <w:t xml:space="preserve">Docker Desktop installed but not running — start it and wait</w:t>
+              <w:t xml:space="preserve">Docker Desktop not installed, or not launched</w:t>
             </w:r>
           </w:p>
         </w:tc>
@@ -7712,15 +8252,7 @@
                 <w:sz w:val="15"/>
                 <w:szCs w:val="15"/>
               </w:rPr>
-              <w:t xml:space="preserve">address already in use</w:t>
-            </w:r>
-            <w:r>
-              <w:rPr>
-                <w:color w:val="13272F"/>
-                <w:sz w:val="17"/>
-                <w:szCs w:val="17"/>
-              </w:rPr>
-              <w:t xml:space="preserve"> on 5432</w:t>
+              <w:t xml:space="preserve">Cannot connect to the Docker daemon</w:t>
             </w:r>
           </w:p>
         </w:tc>
@@ -7745,33 +8277,7 @@
                 <w:sz w:val="17"/>
                 <w:szCs w:val="17"/>
               </w:rPr>
-              <w:t xml:space="preserve">add </w:t>
-            </w:r>
-            <w:r>
-              <w:rPr>
-                <w:rFonts w:ascii="Consolas" w:cs="Consolas" w:eastAsia="Consolas" w:hAnsi="Consolas"/>
-                <w:color w:val="B3651F"/>
-                <w:sz w:val="15"/>
-                <w:szCs w:val="15"/>
-              </w:rPr>
-              <w:t xml:space="preserve">POSTGRES_PORT=5433</w:t>
-            </w:r>
-            <w:r>
-              <w:rPr>
-                <w:color w:val="13272F"/>
-                <w:sz w:val="17"/>
-                <w:szCs w:val="17"/>
-              </w:rPr>
-              <w:t xml:space="preserve"> to </w:t>
-            </w:r>
-            <w:r>
-              <w:rPr>
-                <w:rFonts w:ascii="Consolas" w:cs="Consolas" w:eastAsia="Consolas" w:hAnsi="Consolas"/>
-                <w:color w:val="B3651F"/>
-                <w:sz w:val="15"/>
-                <w:szCs w:val="15"/>
-              </w:rPr>
-              <w:t xml:space="preserve">.env</w:t>
+              <w:t xml:space="preserve">Docker Desktop installed but not running — start it and wait</w:t>
             </w:r>
           </w:p>
         </w:tc>
@@ -7797,45 +8303,71 @@
             </w:pPr>
             <w:r>
               <w:rPr>
-                <w:color w:val="13272F"/>
-                <w:sz w:val="17"/>
-                <w:szCs w:val="17"/>
-              </w:rPr>
-              <w:t xml:space="preserve">Every line shows as changed in a diff</w:t>
-            </w:r>
-          </w:p>
-        </w:tc>
-        <w:tc>
-          <w:tcPr>
-            <w:tcW w:type="dxa" w:w="6240"/>
-            <w:shd w:fill="F7FAFB" w:val="clear"/>
-            <w:tcMar>
-              <w:top w:type="dxa" w:w="70"/>
-              <w:left w:type="dxa" w:w="110"/>
-              <w:bottom w:type="dxa" w:w="70"/>
-              <w:right w:type="dxa" w:w="110"/>
-            </w:tcMar>
-          </w:tcPr>
-          <w:p>
-            <w:pPr>
-              <w:spacing w:after="0" w:before="0"/>
-            </w:pPr>
-            <w:r>
-              <w:rPr>
                 <w:rFonts w:ascii="Consolas" w:cs="Consolas" w:eastAsia="Consolas" w:hAnsi="Consolas"/>
                 <w:color w:val="B3651F"/>
                 <w:sz w:val="15"/>
                 <w:szCs w:val="15"/>
               </w:rPr>
-              <w:t xml:space="preserve">git config --global core.autocrlf true</w:t>
-            </w:r>
-            <w:r>
-              <w:rPr>
-                <w:color w:val="13272F"/>
-                <w:sz w:val="17"/>
-                <w:szCs w:val="17"/>
-              </w:rPr>
-              <w:t xml:space="preserve">, then re-clone</w:t>
+              <w:t xml:space="preserve">address already in use</w:t>
+            </w:r>
+            <w:r>
+              <w:rPr>
+                <w:color w:val="13272F"/>
+                <w:sz w:val="17"/>
+                <w:szCs w:val="17"/>
+              </w:rPr>
+              <w:t xml:space="preserve"> on 5432</w:t>
+            </w:r>
+          </w:p>
+        </w:tc>
+        <w:tc>
+          <w:tcPr>
+            <w:tcW w:type="dxa" w:w="6240"/>
+            <w:shd w:fill="F7FAFB" w:val="clear"/>
+            <w:tcMar>
+              <w:top w:type="dxa" w:w="70"/>
+              <w:left w:type="dxa" w:w="110"/>
+              <w:bottom w:type="dxa" w:w="70"/>
+              <w:right w:type="dxa" w:w="110"/>
+            </w:tcMar>
+          </w:tcPr>
+          <w:p>
+            <w:pPr>
+              <w:spacing w:after="0" w:before="0"/>
+            </w:pPr>
+            <w:r>
+              <w:rPr>
+                <w:color w:val="13272F"/>
+                <w:sz w:val="17"/>
+                <w:szCs w:val="17"/>
+              </w:rPr>
+              <w:t xml:space="preserve">add </w:t>
+            </w:r>
+            <w:r>
+              <w:rPr>
+                <w:rFonts w:ascii="Consolas" w:cs="Consolas" w:eastAsia="Consolas" w:hAnsi="Consolas"/>
+                <w:color w:val="B3651F"/>
+                <w:sz w:val="15"/>
+                <w:szCs w:val="15"/>
+              </w:rPr>
+              <w:t xml:space="preserve">POSTGRES_PORT=5433</w:t>
+            </w:r>
+            <w:r>
+              <w:rPr>
+                <w:color w:val="13272F"/>
+                <w:sz w:val="17"/>
+                <w:szCs w:val="17"/>
+              </w:rPr>
+              <w:t xml:space="preserve"> to </w:t>
+            </w:r>
+            <w:r>
+              <w:rPr>
+                <w:rFonts w:ascii="Consolas" w:cs="Consolas" w:eastAsia="Consolas" w:hAnsi="Consolas"/>
+                <w:color w:val="B3651F"/>
+                <w:sz w:val="15"/>
+                <w:szCs w:val="15"/>
+              </w:rPr>
+              <w:t xml:space="preserve">.env</w:t>
             </w:r>
           </w:p>
         </w:tc>
@@ -7861,71 +8393,45 @@
             </w:pPr>
             <w:r>
               <w:rPr>
+                <w:color w:val="13272F"/>
+                <w:sz w:val="17"/>
+                <w:szCs w:val="17"/>
+              </w:rPr>
+              <w:t xml:space="preserve">Every line shows as changed in a diff</w:t>
+            </w:r>
+          </w:p>
+        </w:tc>
+        <w:tc>
+          <w:tcPr>
+            <w:tcW w:type="dxa" w:w="6240"/>
+            <w:shd w:fill="FFFFFF" w:val="clear"/>
+            <w:tcMar>
+              <w:top w:type="dxa" w:w="70"/>
+              <w:left w:type="dxa" w:w="110"/>
+              <w:bottom w:type="dxa" w:w="70"/>
+              <w:right w:type="dxa" w:w="110"/>
+            </w:tcMar>
+          </w:tcPr>
+          <w:p>
+            <w:pPr>
+              <w:spacing w:after="0" w:before="0"/>
+            </w:pPr>
+            <w:r>
+              <w:rPr>
                 <w:rFonts w:ascii="Consolas" w:cs="Consolas" w:eastAsia="Consolas" w:hAnsi="Consolas"/>
                 <w:color w:val="B3651F"/>
                 <w:sz w:val="15"/>
                 <w:szCs w:val="15"/>
               </w:rPr>
-              <w:t xml:space="preserve">push declined</w:t>
-            </w:r>
-            <w:r>
-              <w:rPr>
-                <w:color w:val="13272F"/>
-                <w:sz w:val="17"/>
-                <w:szCs w:val="17"/>
-              </w:rPr>
-              <w:t xml:space="preserve"> / </w:t>
-            </w:r>
-            <w:r>
-              <w:rPr>
-                <w:rFonts w:ascii="Consolas" w:cs="Consolas" w:eastAsia="Consolas" w:hAnsi="Consolas"/>
-                <w:color w:val="B3651F"/>
-                <w:sz w:val="15"/>
-                <w:szCs w:val="15"/>
-              </w:rPr>
-              <w:t xml:space="preserve">protected branch</w:t>
-            </w:r>
-          </w:p>
-        </w:tc>
-        <w:tc>
-          <w:tcPr>
-            <w:tcW w:type="dxa" w:w="6240"/>
-            <w:shd w:fill="FFFFFF" w:val="clear"/>
-            <w:tcMar>
-              <w:top w:type="dxa" w:w="70"/>
-              <w:left w:type="dxa" w:w="110"/>
-              <w:bottom w:type="dxa" w:w="70"/>
-              <w:right w:type="dxa" w:w="110"/>
-            </w:tcMar>
-          </w:tcPr>
-          <w:p>
-            <w:pPr>
-              <w:spacing w:after="0" w:before="0"/>
-            </w:pPr>
-            <w:r>
-              <w:rPr>
-                <w:color w:val="13272F"/>
-                <w:sz w:val="17"/>
-                <w:szCs w:val="17"/>
-              </w:rPr>
-              <w:t xml:space="preserve">you are on </w:t>
-            </w:r>
-            <w:r>
-              <w:rPr>
-                <w:rFonts w:ascii="Consolas" w:cs="Consolas" w:eastAsia="Consolas" w:hAnsi="Consolas"/>
-                <w:color w:val="B3651F"/>
-                <w:sz w:val="15"/>
-                <w:szCs w:val="15"/>
-              </w:rPr>
-              <w:t xml:space="preserve">main</w:t>
-            </w:r>
-            <w:r>
-              <w:rPr>
-                <w:color w:val="13272F"/>
-                <w:sz w:val="17"/>
-                <w:szCs w:val="17"/>
-              </w:rPr>
-              <w:t xml:space="preserve">. Make a branch — see §7</w:t>
+              <w:t xml:space="preserve">git config --global core.autocrlf true</w:t>
+            </w:r>
+            <w:r>
+              <w:rPr>
+                <w:color w:val="13272F"/>
+                <w:sz w:val="17"/>
+                <w:szCs w:val="17"/>
+              </w:rPr>
+              <w:t xml:space="preserve">, then re-clone</w:t>
             </w:r>
           </w:p>
         </w:tc>
@@ -7951,11 +8457,29 @@
             </w:pPr>
             <w:r>
               <w:rPr>
-                <w:color w:val="13272F"/>
-                <w:sz w:val="17"/>
-                <w:szCs w:val="17"/>
-              </w:rPr>
-              <w:t xml:space="preserve">Tests pass, then fail, nothing changed</w:t>
+                <w:rFonts w:ascii="Consolas" w:cs="Consolas" w:eastAsia="Consolas" w:hAnsi="Consolas"/>
+                <w:color w:val="B3651F"/>
+                <w:sz w:val="15"/>
+                <w:szCs w:val="15"/>
+              </w:rPr>
+              <w:t xml:space="preserve">push declined</w:t>
+            </w:r>
+            <w:r>
+              <w:rPr>
+                <w:color w:val="13272F"/>
+                <w:sz w:val="17"/>
+                <w:szCs w:val="17"/>
+              </w:rPr>
+              <w:t xml:space="preserve"> / </w:t>
+            </w:r>
+            <w:r>
+              <w:rPr>
+                <w:rFonts w:ascii="Consolas" w:cs="Consolas" w:eastAsia="Consolas" w:hAnsi="Consolas"/>
+                <w:color w:val="B3651F"/>
+                <w:sz w:val="15"/>
+                <w:szCs w:val="15"/>
+              </w:rPr>
+              <w:t xml:space="preserve">protected branch</w:t>
             </w:r>
           </w:p>
         </w:tc>
@@ -7963,6 +8487,78 @@
           <w:tcPr>
             <w:tcW w:type="dxa" w:w="6240"/>
             <w:shd w:fill="F7FAFB" w:val="clear"/>
+            <w:tcMar>
+              <w:top w:type="dxa" w:w="70"/>
+              <w:left w:type="dxa" w:w="110"/>
+              <w:bottom w:type="dxa" w:w="70"/>
+              <w:right w:type="dxa" w:w="110"/>
+            </w:tcMar>
+          </w:tcPr>
+          <w:p>
+            <w:pPr>
+              <w:spacing w:after="0" w:before="0"/>
+            </w:pPr>
+            <w:r>
+              <w:rPr>
+                <w:color w:val="13272F"/>
+                <w:sz w:val="17"/>
+                <w:szCs w:val="17"/>
+              </w:rPr>
+              <w:t xml:space="preserve">you are on </w:t>
+            </w:r>
+            <w:r>
+              <w:rPr>
+                <w:rFonts w:ascii="Consolas" w:cs="Consolas" w:eastAsia="Consolas" w:hAnsi="Consolas"/>
+                <w:color w:val="B3651F"/>
+                <w:sz w:val="15"/>
+                <w:szCs w:val="15"/>
+              </w:rPr>
+              <w:t xml:space="preserve">main</w:t>
+            </w:r>
+            <w:r>
+              <w:rPr>
+                <w:color w:val="13272F"/>
+                <w:sz w:val="17"/>
+                <w:szCs w:val="17"/>
+              </w:rPr>
+              <w:t xml:space="preserve">. Make a branch — see §7</w:t>
+            </w:r>
+          </w:p>
+        </w:tc>
+      </w:tr>
+      <w:tr>
+        <w:trPr>
+          <w:tblHeader w:val="false"/>
+        </w:trPr>
+        <w:tc>
+          <w:tcPr>
+            <w:tcW w:type="dxa" w:w="3120"/>
+            <w:shd w:fill="FFFFFF" w:val="clear"/>
+            <w:tcMar>
+              <w:top w:type="dxa" w:w="70"/>
+              <w:left w:type="dxa" w:w="110"/>
+              <w:bottom w:type="dxa" w:w="70"/>
+              <w:right w:type="dxa" w:w="110"/>
+            </w:tcMar>
+          </w:tcPr>
+          <w:p>
+            <w:pPr>
+              <w:spacing w:after="0" w:before="0"/>
+            </w:pPr>
+            <w:r>
+              <w:rPr>
+                <w:color w:val="13272F"/>
+                <w:sz w:val="17"/>
+                <w:szCs w:val="17"/>
+              </w:rPr>
+              <w:t xml:space="preserve">Tests pass, then fail, nothing changed</w:t>
+            </w:r>
+          </w:p>
+        </w:tc>
+        <w:tc>
+          <w:tcPr>
+            <w:tcW w:type="dxa" w:w="6240"/>
+            <w:shd w:fill="FFFFFF" w:val="clear"/>
             <w:tcMar>
               <w:top w:type="dxa" w:w="70"/>
               <w:left w:type="dxa" w:w="110"/>

</xml_diff>